<commit_message>
Add baseline progression section
</commit_message>
<xml_diff>
--- a/data/Fast_as_Fifty_Masterplan_2026.docx
+++ b/data/Fast_as_Fifty_Masterplan_2026.docx
@@ -2874,6 +2874,981 @@
           <w:sz w:val="28"/>
         </w:rPr>
         <w:t>Keep moving forward</w:t>
+      </w:r>
+    </w:p>
+    <w:p>
+      <w:r>
+        <w:br w:type="page"/>
+      </w:r>
+    </w:p>
+    <w:p>
+      <w:pPr>
+        <w:pStyle w:val="Heading1"/>
+      </w:pPr>
+      <w:r>
+        <w:t>Baseline-progression mod racemålene</w:t>
+      </w:r>
+    </w:p>
+    <w:p>
+      <w:r>
+        <w:t>Udgangspunktet for hele planen: en CTL/TSS-kurve fra uge 1 (CTL 30→34) til peak CTL ~64 i uge 11, derefter taper mod Christiansborg Rundt (29/8) og Marathon du Médoc (5/9). Kurven følger Friel-reglerne: max +5-8 CTL/uge i build-uger, flad eller faldende i restitutionsuger, og positiv TSB ved begge raceuger. Faktiske tal sammenlignes med denne baseline hver søndag — afvigelser bruges til at justere kommende ugers belastning, ikke til at omskrive kurven.</w:t>
+      </w:r>
+    </w:p>
+    <w:tbl>
+      <w:tblPr>
+        <w:tblStyle w:val="LightGrid-Accent1"/>
+        <w:tblW w:type="auto" w:w="0"/>
+        <w:tblLook w:firstColumn="1" w:firstRow="1" w:lastColumn="0" w:lastRow="0" w:noHBand="0" w:noVBand="1" w:val="04A0"/>
+      </w:tblPr>
+      <w:tblGrid>
+        <w:gridCol w:w="1440"/>
+        <w:gridCol w:w="1440"/>
+        <w:gridCol w:w="1440"/>
+        <w:gridCol w:w="1440"/>
+        <w:gridCol w:w="1440"/>
+        <w:gridCol w:w="1440"/>
+      </w:tblGrid>
+      <w:tr>
+        <w:tc>
+          <w:tcPr>
+            <w:tcW w:type="dxa" w:w="1440"/>
+          </w:tcPr>
+          <w:p>
+            <w:r>
+              <w:t>Uge</w:t>
+            </w:r>
+          </w:p>
+        </w:tc>
+        <w:tc>
+          <w:tcPr>
+            <w:tcW w:type="dxa" w:w="1440"/>
+          </w:tcPr>
+          <w:p>
+            <w:r>
+              <w:t>Type</w:t>
+            </w:r>
+          </w:p>
+        </w:tc>
+        <w:tc>
+          <w:tcPr>
+            <w:tcW w:type="dxa" w:w="1440"/>
+          </w:tcPr>
+          <w:p>
+            <w:r>
+              <w:t>Target CTL start</w:t>
+            </w:r>
+          </w:p>
+        </w:tc>
+        <w:tc>
+          <w:tcPr>
+            <w:tcW w:type="dxa" w:w="1440"/>
+          </w:tcPr>
+          <w:p>
+            <w:r>
+              <w:t>Target CTL slut</w:t>
+            </w:r>
+          </w:p>
+        </w:tc>
+        <w:tc>
+          <w:tcPr>
+            <w:tcW w:type="dxa" w:w="1440"/>
+          </w:tcPr>
+          <w:p>
+            <w:r>
+              <w:t>Target TSS</w:t>
+            </w:r>
+          </w:p>
+        </w:tc>
+        <w:tc>
+          <w:tcPr>
+            <w:tcW w:type="dxa" w:w="1440"/>
+          </w:tcPr>
+          <w:p>
+            <w:r>
+              <w:t>TSB-mål / note</w:t>
+            </w:r>
+          </w:p>
+        </w:tc>
+      </w:tr>
+      <w:tr>
+        <w:tc>
+          <w:tcPr>
+            <w:tcW w:type="dxa" w:w="1440"/>
+          </w:tcPr>
+          <w:p>
+            <w:r>
+              <w:t>1</w:t>
+            </w:r>
+          </w:p>
+        </w:tc>
+        <w:tc>
+          <w:tcPr>
+            <w:tcW w:type="dxa" w:w="1440"/>
+          </w:tcPr>
+          <w:p>
+            <w:r>
+              <w:t>Build 1</w:t>
+            </w:r>
+          </w:p>
+        </w:tc>
+        <w:tc>
+          <w:tcPr>
+            <w:tcW w:type="dxa" w:w="1440"/>
+          </w:tcPr>
+          <w:p>
+            <w:r>
+              <w:t>30</w:t>
+            </w:r>
+          </w:p>
+        </w:tc>
+        <w:tc>
+          <w:tcPr>
+            <w:tcW w:type="dxa" w:w="1440"/>
+          </w:tcPr>
+          <w:p>
+            <w:r>
+              <w:t>34</w:t>
+            </w:r>
+          </w:p>
+        </w:tc>
+        <w:tc>
+          <w:tcPr>
+            <w:tcW w:type="dxa" w:w="1440"/>
+          </w:tcPr>
+          <w:p>
+            <w:r>
+              <w:t>290</w:t>
+            </w:r>
+          </w:p>
+        </w:tc>
+        <w:tc>
+          <w:tcPr>
+            <w:tcW w:type="dxa" w:w="1440"/>
+          </w:tcPr>
+          <w:p>
+            <w:r>
+              <w:t>Etableringsuge — TSB endte -8</w:t>
+            </w:r>
+          </w:p>
+        </w:tc>
+      </w:tr>
+      <w:tr>
+        <w:tc>
+          <w:tcPr>
+            <w:tcW w:type="dxa" w:w="1440"/>
+          </w:tcPr>
+          <w:p>
+            <w:r>
+              <w:t>2</w:t>
+            </w:r>
+          </w:p>
+        </w:tc>
+        <w:tc>
+          <w:tcPr>
+            <w:tcW w:type="dxa" w:w="1440"/>
+          </w:tcPr>
+          <w:p>
+            <w:r>
+              <w:t>Build 2</w:t>
+            </w:r>
+          </w:p>
+        </w:tc>
+        <w:tc>
+          <w:tcPr>
+            <w:tcW w:type="dxa" w:w="1440"/>
+          </w:tcPr>
+          <w:p>
+            <w:r>
+              <w:t>34</w:t>
+            </w:r>
+          </w:p>
+        </w:tc>
+        <w:tc>
+          <w:tcPr>
+            <w:tcW w:type="dxa" w:w="1440"/>
+          </w:tcPr>
+          <w:p>
+            <w:r>
+              <w:t>39</w:t>
+            </w:r>
+          </w:p>
+        </w:tc>
+        <w:tc>
+          <w:tcPr>
+            <w:tcW w:type="dxa" w:w="1440"/>
+          </w:tcPr>
+          <w:p>
+            <w:r>
+              <w:t>340</w:t>
+            </w:r>
+          </w:p>
+        </w:tc>
+        <w:tc>
+          <w:tcPr>
+            <w:tcW w:type="dxa" w:w="1440"/>
+          </w:tcPr>
+          <w:p>
+            <w:r>
+              <w:t>TSB ca. -10 til -15</w:t>
+            </w:r>
+          </w:p>
+        </w:tc>
+      </w:tr>
+      <w:tr>
+        <w:tc>
+          <w:tcPr>
+            <w:tcW w:type="dxa" w:w="1440"/>
+          </w:tcPr>
+          <w:p>
+            <w:r>
+              <w:t>3</w:t>
+            </w:r>
+          </w:p>
+        </w:tc>
+        <w:tc>
+          <w:tcPr>
+            <w:tcW w:type="dxa" w:w="1440"/>
+          </w:tcPr>
+          <w:p>
+            <w:r>
+              <w:t>Build 3</w:t>
+            </w:r>
+          </w:p>
+        </w:tc>
+        <w:tc>
+          <w:tcPr>
+            <w:tcW w:type="dxa" w:w="1440"/>
+          </w:tcPr>
+          <w:p>
+            <w:r>
+              <w:t>39</w:t>
+            </w:r>
+          </w:p>
+        </w:tc>
+        <w:tc>
+          <w:tcPr>
+            <w:tcW w:type="dxa" w:w="1440"/>
+          </w:tcPr>
+          <w:p>
+            <w:r>
+              <w:t>44</w:t>
+            </w:r>
+          </w:p>
+        </w:tc>
+        <w:tc>
+          <w:tcPr>
+            <w:tcW w:type="dxa" w:w="1440"/>
+          </w:tcPr>
+          <w:p>
+            <w:r>
+              <w:t>370</w:t>
+            </w:r>
+          </w:p>
+        </w:tc>
+        <w:tc>
+          <w:tcPr>
+            <w:tcW w:type="dxa" w:w="1440"/>
+          </w:tcPr>
+          <w:p>
+            <w:r>
+              <w:t>Camp-uge — TSB max -35/-36 ok</w:t>
+            </w:r>
+          </w:p>
+        </w:tc>
+      </w:tr>
+      <w:tr>
+        <w:tc>
+          <w:tcPr>
+            <w:tcW w:type="dxa" w:w="1440"/>
+          </w:tcPr>
+          <w:p>
+            <w:r>
+              <w:t>4</w:t>
+            </w:r>
+          </w:p>
+        </w:tc>
+        <w:tc>
+          <w:tcPr>
+            <w:tcW w:type="dxa" w:w="1440"/>
+          </w:tcPr>
+          <w:p>
+            <w:r>
+              <w:t>Recovery</w:t>
+            </w:r>
+          </w:p>
+        </w:tc>
+        <w:tc>
+          <w:tcPr>
+            <w:tcW w:type="dxa" w:w="1440"/>
+          </w:tcPr>
+          <w:p>
+            <w:r>
+              <w:t>44</w:t>
+            </w:r>
+          </w:p>
+        </w:tc>
+        <w:tc>
+          <w:tcPr>
+            <w:tcW w:type="dxa" w:w="1440"/>
+          </w:tcPr>
+          <w:p>
+            <w:r>
+              <w:t>41</w:t>
+            </w:r>
+          </w:p>
+        </w:tc>
+        <w:tc>
+          <w:tcPr>
+            <w:tcW w:type="dxa" w:w="1440"/>
+          </w:tcPr>
+          <w:p>
+            <w:r>
+              <w:t>180</w:t>
+            </w:r>
+          </w:p>
+        </w:tc>
+        <w:tc>
+          <w:tcPr>
+            <w:tcW w:type="dxa" w:w="1440"/>
+          </w:tcPr>
+          <w:p>
+            <w:r>
+              <w:t>TSB stiger mod -5 til 0</w:t>
+            </w:r>
+          </w:p>
+        </w:tc>
+      </w:tr>
+      <w:tr>
+        <w:tc>
+          <w:tcPr>
+            <w:tcW w:type="dxa" w:w="1440"/>
+          </w:tcPr>
+          <w:p>
+            <w:r>
+              <w:t>5</w:t>
+            </w:r>
+          </w:p>
+        </w:tc>
+        <w:tc>
+          <w:tcPr>
+            <w:tcW w:type="dxa" w:w="1440"/>
+          </w:tcPr>
+          <w:p>
+            <w:r>
+              <w:t>Build 1</w:t>
+            </w:r>
+          </w:p>
+        </w:tc>
+        <w:tc>
+          <w:tcPr>
+            <w:tcW w:type="dxa" w:w="1440"/>
+          </w:tcPr>
+          <w:p>
+            <w:r>
+              <w:t>41</w:t>
+            </w:r>
+          </w:p>
+        </w:tc>
+        <w:tc>
+          <w:tcPr>
+            <w:tcW w:type="dxa" w:w="1440"/>
+          </w:tcPr>
+          <w:p>
+            <w:r>
+              <w:t>46</w:t>
+            </w:r>
+          </w:p>
+        </w:tc>
+        <w:tc>
+          <w:tcPr>
+            <w:tcW w:type="dxa" w:w="1440"/>
+          </w:tcPr>
+          <w:p>
+            <w:r>
+              <w:t>385</w:t>
+            </w:r>
+          </w:p>
+        </w:tc>
+        <w:tc>
+          <w:tcPr>
+            <w:tcW w:type="dxa" w:w="1440"/>
+          </w:tcPr>
+          <w:p>
+            <w:r>
+              <w:t>TSB ca. -10 til -15</w:t>
+            </w:r>
+          </w:p>
+        </w:tc>
+      </w:tr>
+      <w:tr>
+        <w:tc>
+          <w:tcPr>
+            <w:tcW w:type="dxa" w:w="1440"/>
+          </w:tcPr>
+          <w:p>
+            <w:r>
+              <w:t>6</w:t>
+            </w:r>
+          </w:p>
+        </w:tc>
+        <w:tc>
+          <w:tcPr>
+            <w:tcW w:type="dxa" w:w="1440"/>
+          </w:tcPr>
+          <w:p>
+            <w:r>
+              <w:t>Build 2 let</w:t>
+            </w:r>
+          </w:p>
+        </w:tc>
+        <w:tc>
+          <w:tcPr>
+            <w:tcW w:type="dxa" w:w="1440"/>
+          </w:tcPr>
+          <w:p>
+            <w:r>
+              <w:t>46</w:t>
+            </w:r>
+          </w:p>
+        </w:tc>
+        <w:tc>
+          <w:tcPr>
+            <w:tcW w:type="dxa" w:w="1440"/>
+          </w:tcPr>
+          <w:p>
+            <w:r>
+              <w:t>49</w:t>
+            </w:r>
+          </w:p>
+        </w:tc>
+        <w:tc>
+          <w:tcPr>
+            <w:tcW w:type="dxa" w:w="1440"/>
+          </w:tcPr>
+          <w:p>
+            <w:r>
+              <w:t>320</w:t>
+            </w:r>
+          </w:p>
+        </w:tc>
+        <w:tc>
+          <w:tcPr>
+            <w:tcW w:type="dxa" w:w="1440"/>
+          </w:tcPr>
+          <w:p>
+            <w:r>
+              <w:t>Rejseuge — lavere belastning</w:t>
+            </w:r>
+          </w:p>
+        </w:tc>
+      </w:tr>
+      <w:tr>
+        <w:tc>
+          <w:tcPr>
+            <w:tcW w:type="dxa" w:w="1440"/>
+          </w:tcPr>
+          <w:p>
+            <w:r>
+              <w:t>7</w:t>
+            </w:r>
+          </w:p>
+        </w:tc>
+        <w:tc>
+          <w:tcPr>
+            <w:tcW w:type="dxa" w:w="1440"/>
+          </w:tcPr>
+          <w:p>
+            <w:r>
+              <w:t>Build 3</w:t>
+            </w:r>
+          </w:p>
+        </w:tc>
+        <w:tc>
+          <w:tcPr>
+            <w:tcW w:type="dxa" w:w="1440"/>
+          </w:tcPr>
+          <w:p>
+            <w:r>
+              <w:t>49</w:t>
+            </w:r>
+          </w:p>
+        </w:tc>
+        <w:tc>
+          <w:tcPr>
+            <w:tcW w:type="dxa" w:w="1440"/>
+          </w:tcPr>
+          <w:p>
+            <w:r>
+              <w:t>54</w:t>
+            </w:r>
+          </w:p>
+        </w:tc>
+        <w:tc>
+          <w:tcPr>
+            <w:tcW w:type="dxa" w:w="1440"/>
+          </w:tcPr>
+          <w:p>
+            <w:r>
+              <w:t>430</w:t>
+            </w:r>
+          </w:p>
+        </w:tc>
+        <w:tc>
+          <w:tcPr>
+            <w:tcW w:type="dxa" w:w="1440"/>
+          </w:tcPr>
+          <w:p>
+            <w:r>
+              <w:t>Camp-uge — TSB kan nå -30/-35</w:t>
+            </w:r>
+          </w:p>
+        </w:tc>
+      </w:tr>
+      <w:tr>
+        <w:tc>
+          <w:tcPr>
+            <w:tcW w:type="dxa" w:w="1440"/>
+          </w:tcPr>
+          <w:p>
+            <w:r>
+              <w:t>8</w:t>
+            </w:r>
+          </w:p>
+        </w:tc>
+        <w:tc>
+          <w:tcPr>
+            <w:tcW w:type="dxa" w:w="1440"/>
+          </w:tcPr>
+          <w:p>
+            <w:r>
+              <w:t>Recovery</w:t>
+            </w:r>
+          </w:p>
+        </w:tc>
+        <w:tc>
+          <w:tcPr>
+            <w:tcW w:type="dxa" w:w="1440"/>
+          </w:tcPr>
+          <w:p>
+            <w:r>
+              <w:t>54</w:t>
+            </w:r>
+          </w:p>
+        </w:tc>
+        <w:tc>
+          <w:tcPr>
+            <w:tcW w:type="dxa" w:w="1440"/>
+          </w:tcPr>
+          <w:p>
+            <w:r>
+              <w:t>50</w:t>
+            </w:r>
+          </w:p>
+        </w:tc>
+        <w:tc>
+          <w:tcPr>
+            <w:tcW w:type="dxa" w:w="1440"/>
+          </w:tcPr>
+          <w:p>
+            <w:r>
+              <w:t>215</w:t>
+            </w:r>
+          </w:p>
+        </w:tc>
+        <w:tc>
+          <w:tcPr>
+            <w:tcW w:type="dxa" w:w="1440"/>
+          </w:tcPr>
+          <w:p>
+            <w:r>
+              <w:t>TSB stiger mod 0</w:t>
+            </w:r>
+          </w:p>
+        </w:tc>
+      </w:tr>
+      <w:tr>
+        <w:tc>
+          <w:tcPr>
+            <w:tcW w:type="dxa" w:w="1440"/>
+          </w:tcPr>
+          <w:p>
+            <w:r>
+              <w:t>9</w:t>
+            </w:r>
+          </w:p>
+        </w:tc>
+        <w:tc>
+          <w:tcPr>
+            <w:tcW w:type="dxa" w:w="1440"/>
+          </w:tcPr>
+          <w:p>
+            <w:r>
+              <w:t>Build 1</w:t>
+            </w:r>
+          </w:p>
+        </w:tc>
+        <w:tc>
+          <w:tcPr>
+            <w:tcW w:type="dxa" w:w="1440"/>
+          </w:tcPr>
+          <w:p>
+            <w:r>
+              <w:t>50</w:t>
+            </w:r>
+          </w:p>
+        </w:tc>
+        <w:tc>
+          <w:tcPr>
+            <w:tcW w:type="dxa" w:w="1440"/>
+          </w:tcPr>
+          <w:p>
+            <w:r>
+              <w:t>55</w:t>
+            </w:r>
+          </w:p>
+        </w:tc>
+        <w:tc>
+          <w:tcPr>
+            <w:tcW w:type="dxa" w:w="1440"/>
+          </w:tcPr>
+          <w:p>
+            <w:r>
+              <w:t>440</w:t>
+            </w:r>
+          </w:p>
+        </w:tc>
+        <w:tc>
+          <w:tcPr>
+            <w:tcW w:type="dxa" w:w="1440"/>
+          </w:tcPr>
+          <w:p>
+            <w:r>
+              <w:t>TSB ca. -10 til -15</w:t>
+            </w:r>
+          </w:p>
+        </w:tc>
+      </w:tr>
+      <w:tr>
+        <w:tc>
+          <w:tcPr>
+            <w:tcW w:type="dxa" w:w="1440"/>
+          </w:tcPr>
+          <w:p>
+            <w:r>
+              <w:t>10</w:t>
+            </w:r>
+          </w:p>
+        </w:tc>
+        <w:tc>
+          <w:tcPr>
+            <w:tcW w:type="dxa" w:w="1440"/>
+          </w:tcPr>
+          <w:p>
+            <w:r>
+              <w:t>Build 2</w:t>
+            </w:r>
+          </w:p>
+        </w:tc>
+        <w:tc>
+          <w:tcPr>
+            <w:tcW w:type="dxa" w:w="1440"/>
+          </w:tcPr>
+          <w:p>
+            <w:r>
+              <w:t>55</w:t>
+            </w:r>
+          </w:p>
+        </w:tc>
+        <w:tc>
+          <w:tcPr>
+            <w:tcW w:type="dxa" w:w="1440"/>
+          </w:tcPr>
+          <w:p>
+            <w:r>
+              <w:t>60</w:t>
+            </w:r>
+          </w:p>
+        </w:tc>
+        <w:tc>
+          <w:tcPr>
+            <w:tcW w:type="dxa" w:w="1440"/>
+          </w:tcPr>
+          <w:p>
+            <w:r>
+              <w:t>470</w:t>
+            </w:r>
+          </w:p>
+        </w:tc>
+        <w:tc>
+          <w:tcPr>
+            <w:tcW w:type="dxa" w:w="1440"/>
+          </w:tcPr>
+          <w:p>
+            <w:r>
+              <w:t>TSB ca. -15</w:t>
+            </w:r>
+          </w:p>
+        </w:tc>
+      </w:tr>
+      <w:tr>
+        <w:tc>
+          <w:tcPr>
+            <w:tcW w:type="dxa" w:w="1440"/>
+          </w:tcPr>
+          <w:p>
+            <w:r>
+              <w:t>11</w:t>
+            </w:r>
+          </w:p>
+        </w:tc>
+        <w:tc>
+          <w:tcPr>
+            <w:tcW w:type="dxa" w:w="1440"/>
+          </w:tcPr>
+          <w:p>
+            <w:r>
+              <w:t>Build 3</w:t>
+            </w:r>
+          </w:p>
+        </w:tc>
+        <w:tc>
+          <w:tcPr>
+            <w:tcW w:type="dxa" w:w="1440"/>
+          </w:tcPr>
+          <w:p>
+            <w:r>
+              <w:t>60</w:t>
+            </w:r>
+          </w:p>
+        </w:tc>
+        <w:tc>
+          <w:tcPr>
+            <w:tcW w:type="dxa" w:w="1440"/>
+          </w:tcPr>
+          <w:p>
+            <w:r>
+              <w:t>64</w:t>
+            </w:r>
+          </w:p>
+        </w:tc>
+        <w:tc>
+          <w:tcPr>
+            <w:tcW w:type="dxa" w:w="1440"/>
+          </w:tcPr>
+          <w:p>
+            <w:r>
+              <w:t>470</w:t>
+            </w:r>
+          </w:p>
+        </w:tc>
+        <w:tc>
+          <w:tcPr>
+            <w:tcW w:type="dxa" w:w="1440"/>
+          </w:tcPr>
+          <w:p>
+            <w:r>
+              <w:t>Peak CTL — sidste hårde blok</w:t>
+            </w:r>
+          </w:p>
+        </w:tc>
+      </w:tr>
+      <w:tr>
+        <w:tc>
+          <w:tcPr>
+            <w:tcW w:type="dxa" w:w="1440"/>
+          </w:tcPr>
+          <w:p>
+            <w:r>
+              <w:t>12</w:t>
+            </w:r>
+          </w:p>
+        </w:tc>
+        <w:tc>
+          <w:tcPr>
+            <w:tcW w:type="dxa" w:w="1440"/>
+          </w:tcPr>
+          <w:p>
+            <w:r>
+              <w:t>Pre-race</w:t>
+            </w:r>
+          </w:p>
+        </w:tc>
+        <w:tc>
+          <w:tcPr>
+            <w:tcW w:type="dxa" w:w="1440"/>
+          </w:tcPr>
+          <w:p>
+            <w:r>
+              <w:t>64</w:t>
+            </w:r>
+          </w:p>
+        </w:tc>
+        <w:tc>
+          <w:tcPr>
+            <w:tcW w:type="dxa" w:w="1440"/>
+          </w:tcPr>
+          <w:p>
+            <w:r>
+              <w:t>60</w:t>
+            </w:r>
+          </w:p>
+        </w:tc>
+        <w:tc>
+          <w:tcPr>
+            <w:tcW w:type="dxa" w:w="1440"/>
+          </w:tcPr>
+          <w:p>
+            <w:r>
+              <w:t>275</w:t>
+            </w:r>
+          </w:p>
+        </w:tc>
+        <w:tc>
+          <w:tcPr>
+            <w:tcW w:type="dxa" w:w="1440"/>
+          </w:tcPr>
+          <w:p>
+            <w:r>
+              <w:t>Taper start — TSB stiger mod +5</w:t>
+            </w:r>
+          </w:p>
+        </w:tc>
+      </w:tr>
+      <w:tr>
+        <w:tc>
+          <w:tcPr>
+            <w:tcW w:type="dxa" w:w="1440"/>
+          </w:tcPr>
+          <w:p>
+            <w:r>
+              <w:t>13</w:t>
+            </w:r>
+          </w:p>
+        </w:tc>
+        <w:tc>
+          <w:tcPr>
+            <w:tcW w:type="dxa" w:w="1440"/>
+          </w:tcPr>
+          <w:p>
+            <w:r>
+              <w:t>Race</w:t>
+            </w:r>
+          </w:p>
+        </w:tc>
+        <w:tc>
+          <w:tcPr>
+            <w:tcW w:type="dxa" w:w="1440"/>
+          </w:tcPr>
+          <w:p>
+            <w:r>
+              <w:t>60</w:t>
+            </w:r>
+          </w:p>
+        </w:tc>
+        <w:tc>
+          <w:tcPr>
+            <w:tcW w:type="dxa" w:w="1440"/>
+          </w:tcPr>
+          <w:p>
+            <w:r>
+              <w:t>57</w:t>
+            </w:r>
+          </w:p>
+        </w:tc>
+        <w:tc>
+          <w:tcPr>
+            <w:tcW w:type="dxa" w:w="1440"/>
+          </w:tcPr>
+          <w:p>
+            <w:r>
+              <w:t>250</w:t>
+            </w:r>
+          </w:p>
+        </w:tc>
+        <w:tc>
+          <w:tcPr>
+            <w:tcW w:type="dxa" w:w="1440"/>
+          </w:tcPr>
+          <w:p>
+            <w:r>
+              <w:t>Christiansborg 29/8 — TSB target +5 til +10</w:t>
+            </w:r>
+          </w:p>
+        </w:tc>
+      </w:tr>
+      <w:tr>
+        <w:tc>
+          <w:tcPr>
+            <w:tcW w:type="dxa" w:w="1440"/>
+          </w:tcPr>
+          <w:p>
+            <w:r>
+              <w:t>14</w:t>
+            </w:r>
+          </w:p>
+        </w:tc>
+        <w:tc>
+          <w:tcPr>
+            <w:tcW w:type="dxa" w:w="1440"/>
+          </w:tcPr>
+          <w:p>
+            <w:r>
+              <w:t>Médoc</w:t>
+            </w:r>
+          </w:p>
+        </w:tc>
+        <w:tc>
+          <w:tcPr>
+            <w:tcW w:type="dxa" w:w="1440"/>
+          </w:tcPr>
+          <w:p>
+            <w:r>
+              <w:t>57</w:t>
+            </w:r>
+          </w:p>
+        </w:tc>
+        <w:tc>
+          <w:tcPr>
+            <w:tcW w:type="dxa" w:w="1440"/>
+          </w:tcPr>
+          <w:p>
+            <w:r>
+              <w:t>54</w:t>
+            </w:r>
+          </w:p>
+        </w:tc>
+        <w:tc>
+          <w:tcPr>
+            <w:tcW w:type="dxa" w:w="1440"/>
+          </w:tcPr>
+          <w:p>
+            <w:r>
+              <w:t>200</w:t>
+            </w:r>
+          </w:p>
+        </w:tc>
+        <w:tc>
+          <w:tcPr>
+            <w:tcW w:type="dxa" w:w="1440"/>
+          </w:tcPr>
+          <w:p>
+            <w:r>
+              <w:t>Marathon Médoc 5/9 — TSB target +10 til +15</w:t>
+            </w:r>
+          </w:p>
+        </w:tc>
+      </w:tr>
+    </w:tbl>
+    <w:p/>
+    <w:p>
+      <w:r>
+        <w:rPr>
+          <w:b/>
+        </w:rPr>
+        <w:t xml:space="preserve">Justeringsprincip: </w:t>
+      </w:r>
+      <w:r>
+        <w:t>Hvis faktisk CTL/TSS afviger markant fra target (f.eks. pga. rejse, sygdom eller en ekstra god uge), justeres KOMMENDE ugers TSS-target tilsvarende — men loftet på +5-8 CTL/uge og TSB-floor på -30 (-35 i camps) overskrives aldrig. Peak CTL ~64 og positiv TSB ved racestart er de faste pejlemærker.</w:t>
       </w:r>
     </w:p>
     <w:sectPr>

</xml_diff>

<commit_message>
Uge 3: faktiske resultater (Formentor 149km, 386 TSS) erstatter gammel plan. Uge 4: ny restitutionsplan tilføjet. 14-ugers oversigt opdateret med TSS for uge 3-4.
</commit_message>
<xml_diff>
--- a/data/Fast_as_Fifty_Masterplan_2026.docx
+++ b/data/Fast_as_Fifty_Masterplan_2026.docx
@@ -54,11 +54,6 @@
         </w:rPr>
         <w:t>Christiansborg Rundt — 2.000 m svøm — 29. august 2026</w:t>
         <w:br/>
-      </w:r>
-      <w:r>
-        <w:rPr>
-          <w:b/>
-        </w:rPr>
         <w:t>Marathon du Médoc — 5. september 2026</w:t>
         <w:br/>
       </w:r>
@@ -965,7 +960,9 @@
             <w:tcW w:type="dxa" w:w="1728"/>
           </w:tcPr>
           <w:p>
-            <w:r/>
+            <w:r>
+              <w:t>386 TSS (faktisk)</w:t>
+            </w:r>
           </w:p>
         </w:tc>
       </w:tr>
@@ -1015,7 +1012,9 @@
             <w:tcW w:type="dxa" w:w="1728"/>
           </w:tcPr>
           <w:p>
-            <w:r/>
+            <w:r>
+              <w:t>~195 TSS (planlagt)</w:t>
+            </w:r>
           </w:p>
         </w:tc>
       </w:tr>
@@ -2511,7 +2510,7 @@
           </w:tcPr>
           <w:p>
             <w:r>
-              <w:t>Svøm + lang løb</w:t>
+              <w:t>Lang løb Z2</w:t>
             </w:r>
           </w:p>
         </w:tc>
@@ -2521,7 +2520,7 @@
           </w:tcPr>
           <w:p>
             <w:r>
-              <w:t>30+60 min</w:t>
+              <w:t>89 min</w:t>
             </w:r>
           </w:p>
         </w:tc>
@@ -2531,7 +2530,7 @@
           </w:tcPr>
           <w:p>
             <w:r>
-              <w:t>Møde 13:00 — træning afsluttet inden. Z2 base</w:t>
+              <w:t>Sóller — som planlagt, 75 TSS</w:t>
             </w:r>
           </w:p>
         </w:tc>
@@ -2563,7 +2562,7 @@
           </w:tcPr>
           <w:p>
             <w:r>
-              <w:t>Lang cykel + open-water svøm</w:t>
+              <w:t>Cykel Formentor 149km</w:t>
             </w:r>
           </w:p>
         </w:tc>
@@ -2573,7 +2572,7 @@
           </w:tcPr>
           <w:p>
             <w:r>
-              <w:t>2,5-3 t + 20 min</w:t>
+              <w:t>7,5 t</w:t>
             </w:r>
           </w:p>
         </w:tc>
@@ -2583,7 +2582,7 @@
           </w:tcPr>
           <w:p>
             <w:r>
-              <w:t>Mallorca volumen-dag + ekstra svøm</w:t>
+              <w:t>Fornalutx — ugens nøglepas, 128 TSS (Z2-tungt)</w:t>
             </w:r>
           </w:p>
         </w:tc>
@@ -2605,7 +2604,7 @@
           </w:tcPr>
           <w:p>
             <w:r>
-              <w:t>08:00</w:t>
+              <w:t>09:15</w:t>
             </w:r>
           </w:p>
         </w:tc>
@@ -2615,7 +2614,7 @@
           </w:tcPr>
           <w:p>
             <w:r>
-              <w:t>VO2 cykel-intervaller</w:t>
+              <w:t>Open water svøm let</w:t>
             </w:r>
           </w:p>
         </w:tc>
@@ -2625,7 +2624,7 @@
           </w:tcPr>
           <w:p>
             <w:r>
-              <w:t>75 min</w:t>
+              <w:t>34 min</w:t>
             </w:r>
           </w:p>
         </w:tc>
@@ -2635,7 +2634,7 @@
           </w:tcPr>
           <w:p>
             <w:r>
-              <w:t>VO2-stimulus #1 i uge 3</w:t>
+              <w:t>Sóller — som planlagt, 16 TSS</w:t>
             </w:r>
           </w:p>
         </w:tc>
@@ -2657,7 +2656,7 @@
           </w:tcPr>
           <w:p>
             <w:r>
-              <w:t>08:00</w:t>
+              <w:t>07:55</w:t>
             </w:r>
           </w:p>
         </w:tc>
@@ -2677,7 +2676,7 @@
           </w:tcPr>
           <w:p>
             <w:r>
-              <w:t>60 min</w:t>
+              <w:t>95 min</w:t>
             </w:r>
           </w:p>
         </w:tc>
@@ -2687,7 +2686,7 @@
           </w:tcPr>
           <w:p>
             <w:r>
-              <w:t>Sidste dag i Mallorca, fly hjem aften</w:t>
+              <w:t>Fornalutx → fly hjem aften, 25 TSS</w:t>
             </w:r>
           </w:p>
         </w:tc>
@@ -2709,7 +2708,7 @@
           </w:tcPr>
           <w:p>
             <w:r>
-              <w:t>07:00</w:t>
+              <w:t>07:25</w:t>
             </w:r>
           </w:p>
         </w:tc>
@@ -2719,7 +2718,7 @@
           </w:tcPr>
           <w:p>
             <w:r>
-              <w:t>Styrke fuld</w:t>
+              <w:t>Styrke</w:t>
             </w:r>
           </w:p>
         </w:tc>
@@ -2729,7 +2728,7 @@
           </w:tcPr>
           <w:p>
             <w:r>
-              <w:t>45 min</w:t>
+              <w:t>30 min</w:t>
             </w:r>
           </w:p>
         </w:tc>
@@ -2739,7 +2738,7 @@
           </w:tcPr>
           <w:p>
             <w:r>
-              <w:t>Hjemme igen</w:t>
+              <w:t>Hjemme efter hjemrejse, 6 TSS</w:t>
             </w:r>
           </w:p>
         </w:tc>
@@ -2761,7 +2760,7 @@
           </w:tcPr>
           <w:p>
             <w:r>
-              <w:t>08:00</w:t>
+              <w:t>08:59</w:t>
             </w:r>
           </w:p>
         </w:tc>
@@ -2771,7 +2770,7 @@
           </w:tcPr>
           <w:p>
             <w:r>
-              <w:t>Løb</w:t>
+              <w:t>Løb + ekstra let cykel</w:t>
             </w:r>
           </w:p>
         </w:tc>
@@ -2781,7 +2780,7 @@
           </w:tcPr>
           <w:p>
             <w:r>
-              <w:t>60 min</w:t>
+              <w:t>60+42 min</w:t>
             </w:r>
           </w:p>
         </w:tc>
@@ -2791,7 +2790,7 @@
           </w:tcPr>
           <w:p>
             <w:r>
-              <w:t>Reduceret 75→60 min (Friel TSB-analyse, TSB ~-36)</w:t>
+              <w:t>Reduceret til 60 min (TSB-floor) + uplanlagt cykeltur, 76 TSS</w:t>
             </w:r>
           </w:p>
         </w:tc>
@@ -2813,7 +2812,7 @@
           </w:tcPr>
           <w:p>
             <w:r>
-              <w:t>08:00</w:t>
+              <w:t>09:31</w:t>
             </w:r>
           </w:p>
         </w:tc>
@@ -2823,7 +2822,7 @@
           </w:tcPr>
           <w:p>
             <w:r>
-              <w:t>Svøm</w:t>
+              <w:t>Cykel (byttet fra svøm)</w:t>
             </w:r>
           </w:p>
         </w:tc>
@@ -2833,6 +2832,185 @@
           </w:tcPr>
           <w:p>
             <w:r>
+              <w:t>173 min</w:t>
+            </w:r>
+          </w:p>
+        </w:tc>
+        <w:tc>
+          <w:tcPr>
+            <w:tcW w:type="dxa" w:w="1728"/>
+          </w:tcPr>
+          <w:p>
+            <w:r>
+              <w:t>Eget valg på dagen i stedet for planlagt svøm, 60 TSS</w:t>
+            </w:r>
+          </w:p>
+        </w:tc>
+      </w:tr>
+    </w:tbl>
+    <w:p/>
+    <w:p>
+      <w:pPr>
+        <w:pStyle w:val="Heading2"/>
+      </w:pPr>
+      <w:r>
+        <w:t>Uge 4 · 22.–28. juni · Recovery: Tilbage til hverdagen</w:t>
+      </w:r>
+    </w:p>
+    <w:tbl>
+      <w:tblPr>
+        <w:tblStyle w:val="LightGrid-Accent1"/>
+        <w:tblW w:type="auto" w:w="0"/>
+        <w:tblLook w:firstColumn="1" w:firstRow="1" w:lastColumn="0" w:lastRow="0" w:noHBand="0" w:noVBand="1" w:val="04A0"/>
+      </w:tblPr>
+      <w:tblGrid>
+        <w:gridCol w:w="1728"/>
+        <w:gridCol w:w="1728"/>
+        <w:gridCol w:w="1728"/>
+        <w:gridCol w:w="1728"/>
+        <w:gridCol w:w="1728"/>
+      </w:tblGrid>
+      <w:tr>
+        <w:tc>
+          <w:tcPr>
+            <w:tcW w:type="dxa" w:w="1728"/>
+          </w:tcPr>
+          <w:p>
+            <w:r>
+              <w:t>Dag</w:t>
+            </w:r>
+          </w:p>
+        </w:tc>
+        <w:tc>
+          <w:tcPr>
+            <w:tcW w:type="dxa" w:w="1728"/>
+          </w:tcPr>
+          <w:p>
+            <w:r>
+              <w:t>Dato</w:t>
+            </w:r>
+          </w:p>
+        </w:tc>
+        <w:tc>
+          <w:tcPr>
+            <w:tcW w:type="dxa" w:w="1728"/>
+          </w:tcPr>
+          <w:p>
+            <w:r>
+              <w:t>Træning</w:t>
+            </w:r>
+          </w:p>
+        </w:tc>
+        <w:tc>
+          <w:tcPr>
+            <w:tcW w:type="dxa" w:w="1728"/>
+          </w:tcPr>
+          <w:p>
+            <w:r>
+              <w:t>Varighed</w:t>
+            </w:r>
+          </w:p>
+        </w:tc>
+        <w:tc>
+          <w:tcPr>
+            <w:tcW w:type="dxa" w:w="1728"/>
+          </w:tcPr>
+          <w:p>
+            <w:r>
+              <w:t>Detaljer</w:t>
+            </w:r>
+          </w:p>
+        </w:tc>
+      </w:tr>
+      <w:tr>
+        <w:tc>
+          <w:tcPr>
+            <w:tcW w:type="dxa" w:w="1728"/>
+          </w:tcPr>
+          <w:p>
+            <w:r>
+              <w:t>Man 22/6</w:t>
+            </w:r>
+          </w:p>
+        </w:tc>
+        <w:tc>
+          <w:tcPr>
+            <w:tcW w:type="dxa" w:w="1728"/>
+          </w:tcPr>
+          <w:p>
+            <w:r>
+              <w:t>06:00</w:t>
+            </w:r>
+          </w:p>
+        </w:tc>
+        <w:tc>
+          <w:tcPr>
+            <w:tcW w:type="dxa" w:w="1728"/>
+          </w:tcPr>
+          <w:p>
+            <w:r>
+              <w:t>Svøm let recovery</w:t>
+            </w:r>
+          </w:p>
+        </w:tc>
+        <w:tc>
+          <w:tcPr>
+            <w:tcW w:type="dxa" w:w="1728"/>
+          </w:tcPr>
+          <w:p>
+            <w:r>
+              <w:t>30 min</w:t>
+            </w:r>
+          </w:p>
+        </w:tc>
+        <w:tc>
+          <w:tcPr>
+            <w:tcW w:type="dxa" w:w="1728"/>
+          </w:tcPr>
+          <w:p>
+            <w:r>
+              <w:t>Svømmehal, før hjemmekontor. Teknik-fokus</w:t>
+            </w:r>
+          </w:p>
+        </w:tc>
+      </w:tr>
+      <w:tr>
+        <w:tc>
+          <w:tcPr>
+            <w:tcW w:type="dxa" w:w="1728"/>
+          </w:tcPr>
+          <w:p>
+            <w:r>
+              <w:t>Tirs 23/6</w:t>
+            </w:r>
+          </w:p>
+        </w:tc>
+        <w:tc>
+          <w:tcPr>
+            <w:tcW w:type="dxa" w:w="1728"/>
+          </w:tcPr>
+          <w:p>
+            <w:r>
+              <w:t>06:30</w:t>
+            </w:r>
+          </w:p>
+        </w:tc>
+        <w:tc>
+          <w:tcPr>
+            <w:tcW w:type="dxa" w:w="1728"/>
+          </w:tcPr>
+          <w:p>
+            <w:r>
+              <w:t>Løb Z2</w:t>
+            </w:r>
+          </w:p>
+        </w:tc>
+        <w:tc>
+          <w:tcPr>
+            <w:tcW w:type="dxa" w:w="1728"/>
+          </w:tcPr>
+          <w:p>
+            <w:r>
               <w:t>45 min</w:t>
             </w:r>
           </w:p>
@@ -2843,7 +3021,267 @@
           </w:tcPr>
           <w:p>
             <w:r>
-              <w:t>Recovery</w:t>
+              <w:t>God formiddag — prioriteret vindue</w:t>
+            </w:r>
+          </w:p>
+        </w:tc>
+      </w:tr>
+      <w:tr>
+        <w:tc>
+          <w:tcPr>
+            <w:tcW w:type="dxa" w:w="1728"/>
+          </w:tcPr>
+          <w:p>
+            <w:r>
+              <w:t>Ons 24/6</w:t>
+            </w:r>
+          </w:p>
+        </w:tc>
+        <w:tc>
+          <w:tcPr>
+            <w:tcW w:type="dxa" w:w="1728"/>
+          </w:tcPr>
+          <w:p>
+            <w:r>
+              <w:t>07:00</w:t>
+            </w:r>
+          </w:p>
+        </w:tc>
+        <w:tc>
+          <w:tcPr>
+            <w:tcW w:type="dxa" w:w="1728"/>
+          </w:tcPr>
+          <w:p>
+            <w:r>
+              <w:t>Let cykel-spin</w:t>
+            </w:r>
+          </w:p>
+        </w:tc>
+        <w:tc>
+          <w:tcPr>
+            <w:tcW w:type="dxa" w:w="1728"/>
+          </w:tcPr>
+          <w:p>
+            <w:r>
+              <w:t>30 min</w:t>
+            </w:r>
+          </w:p>
+        </w:tc>
+        <w:tc>
+          <w:tcPr>
+            <w:tcW w:type="dxa" w:w="1728"/>
+          </w:tcPr>
+          <w:p>
+            <w:r>
+              <w:t>Workshop-dag (Ambu Marketing) — kort pas tidlig morgen</w:t>
+            </w:r>
+          </w:p>
+        </w:tc>
+      </w:tr>
+      <w:tr>
+        <w:tc>
+          <w:tcPr>
+            <w:tcW w:type="dxa" w:w="1728"/>
+          </w:tcPr>
+          <w:p>
+            <w:r>
+              <w:t>Tor 25/6</w:t>
+            </w:r>
+          </w:p>
+        </w:tc>
+        <w:tc>
+          <w:tcPr>
+            <w:tcW w:type="dxa" w:w="1728"/>
+          </w:tcPr>
+          <w:p>
+            <w:r>
+              <w:t>16:00</w:t>
+            </w:r>
+          </w:p>
+        </w:tc>
+        <w:tc>
+          <w:tcPr>
+            <w:tcW w:type="dxa" w:w="1728"/>
+          </w:tcPr>
+          <w:p>
+            <w:r>
+              <w:t>Cykel Z2</w:t>
+            </w:r>
+          </w:p>
+        </w:tc>
+        <w:tc>
+          <w:tcPr>
+            <w:tcW w:type="dxa" w:w="1728"/>
+          </w:tcPr>
+          <w:p>
+            <w:r>
+              <w:t>45 min</w:t>
+            </w:r>
+          </w:p>
+        </w:tc>
+        <w:tc>
+          <w:tcPr>
+            <w:tcW w:type="dxa" w:w="1728"/>
+          </w:tcPr>
+          <w:p>
+            <w:r>
+              <w:t>Eftermiddag — job fylder formiddagen</w:t>
+            </w:r>
+          </w:p>
+        </w:tc>
+      </w:tr>
+      <w:tr>
+        <w:tc>
+          <w:tcPr>
+            <w:tcW w:type="dxa" w:w="1728"/>
+          </w:tcPr>
+          <w:p>
+            <w:r>
+              <w:t>Fre 26/6</w:t>
+            </w:r>
+          </w:p>
+        </w:tc>
+        <w:tc>
+          <w:tcPr>
+            <w:tcW w:type="dxa" w:w="1728"/>
+          </w:tcPr>
+          <w:p>
+            <w:r>
+              <w:t>—</w:t>
+            </w:r>
+          </w:p>
+        </w:tc>
+        <w:tc>
+          <w:tcPr>
+            <w:tcW w:type="dxa" w:w="1728"/>
+          </w:tcPr>
+          <w:p>
+            <w:r>
+              <w:t>Hvile</w:t>
+            </w:r>
+          </w:p>
+        </w:tc>
+        <w:tc>
+          <w:tcPr>
+            <w:tcW w:type="dxa" w:w="1728"/>
+          </w:tcPr>
+          <w:p>
+            <w:r>
+              <w:t>—</w:t>
+            </w:r>
+          </w:p>
+        </w:tc>
+        <w:tc>
+          <w:tcPr>
+            <w:tcW w:type="dxa" w:w="1728"/>
+          </w:tcPr>
+          <w:p>
+            <w:r>
+              <w:t>Ædge Dag — job-fyldt, ingen træning</w:t>
+            </w:r>
+          </w:p>
+        </w:tc>
+      </w:tr>
+      <w:tr>
+        <w:tc>
+          <w:tcPr>
+            <w:tcW w:type="dxa" w:w="1728"/>
+          </w:tcPr>
+          <w:p>
+            <w:r>
+              <w:t>Lør 27/6</w:t>
+            </w:r>
+          </w:p>
+        </w:tc>
+        <w:tc>
+          <w:tcPr>
+            <w:tcW w:type="dxa" w:w="1728"/>
+          </w:tcPr>
+          <w:p>
+            <w:r>
+              <w:t>06:30</w:t>
+            </w:r>
+          </w:p>
+        </w:tc>
+        <w:tc>
+          <w:tcPr>
+            <w:tcW w:type="dxa" w:w="1728"/>
+          </w:tcPr>
+          <w:p>
+            <w:r>
+              <w:t>Lang løb Z2</w:t>
+            </w:r>
+          </w:p>
+        </w:tc>
+        <w:tc>
+          <w:tcPr>
+            <w:tcW w:type="dxa" w:w="1728"/>
+          </w:tcPr>
+          <w:p>
+            <w:r>
+              <w:t>90 min</w:t>
+            </w:r>
+          </w:p>
+        </w:tc>
+        <w:tc>
+          <w:tcPr>
+            <w:tcW w:type="dxa" w:w="1728"/>
+          </w:tcPr>
+          <w:p>
+            <w:r>
+              <w:t>God weekend — forlænget fra 45 til 90 min efter ønske</w:t>
+            </w:r>
+          </w:p>
+        </w:tc>
+      </w:tr>
+      <w:tr>
+        <w:tc>
+          <w:tcPr>
+            <w:tcW w:type="dxa" w:w="1728"/>
+          </w:tcPr>
+          <w:p>
+            <w:r>
+              <w:t>Søn 28/6</w:t>
+            </w:r>
+          </w:p>
+        </w:tc>
+        <w:tc>
+          <w:tcPr>
+            <w:tcW w:type="dxa" w:w="1728"/>
+          </w:tcPr>
+          <w:p>
+            <w:r>
+              <w:t>06:00</w:t>
+            </w:r>
+          </w:p>
+        </w:tc>
+        <w:tc>
+          <w:tcPr>
+            <w:tcW w:type="dxa" w:w="1728"/>
+          </w:tcPr>
+          <w:p>
+            <w:r>
+              <w:t>Svøm let teknisk</w:t>
+            </w:r>
+          </w:p>
+        </w:tc>
+        <w:tc>
+          <w:tcPr>
+            <w:tcW w:type="dxa" w:w="1728"/>
+          </w:tcPr>
+          <w:p>
+            <w:r>
+              <w:t>45 min</w:t>
+            </w:r>
+          </w:p>
+        </w:tc>
+        <w:tc>
+          <w:tcPr>
+            <w:tcW w:type="dxa" w:w="1728"/>
+          </w:tcPr>
+          <w:p>
+            <w:r>
+              <w:t>Afslutning på restitutionsugen</w:t>
             </w:r>
           </w:p>
         </w:tc>
@@ -2856,7 +3294,7 @@
         <w:rPr>
           <w:b/>
         </w:rPr>
-        <w:t xml:space="preserve">Uge 4-14: </w:t>
+        <w:t xml:space="preserve">Uge 5-14: </w:t>
       </w:r>
       <w:r>
         <w:t>Detaljer udfyldes løbende i takt med at de bygges i build_workouts.py og pushes til Intervals.icu. Dette dokument regenereres ved større revisioner af planen.</w:t>

</xml_diff>

<commit_message>
feat: masterplan.docx — rekalibreret CTL + peak 68 + vægtmål 70 kg
</commit_message>
<xml_diff>
--- a/data/Fast_as_Fifty_Masterplan_2026.docx
+++ b/data/Fast_as_Fifty_Masterplan_2026.docx
@@ -3329,7 +3329,7 @@
     </w:p>
     <w:p>
       <w:r>
-        <w:t>Udgangspunktet for hele planen: en CTL/TSS-kurve fra uge 1 (CTL 30→34) til peak CTL ~64 i uge 11, derefter taper mod Christiansborg Rundt (29/8) og Marathon du Médoc (5/9). Kurven følger Friel-reglerne: max +5-8 CTL/uge i build-uger, flad eller faldende i restitutionsuger, og positiv TSB ved begge raceuger. Faktiske tal sammenlignes med denne baseline hver søndag — afvigelser bruges til at justere kommende ugers belastning, ikke til at omskrive kurven.</w:t>
+        <w:t>Udgangspunktet for hele planen: en CTL/TSS-kurve fra uge 1 (CTL 30→34) til peak CTL ~68 i uge 11, derefter taper mod Christiansborg Rundt (29/8) og Marathon du Médoc (5/9). Kurven følger Friel-reglerne: max +5-8 CTL/uge i build-uger, flad eller faldende i restitutionsuger, og positiv TSB ved begge raceuger. Faktiske tal sammenlignes med denne baseline hver søndag — afvigelser bruges til at justere kommende ugers belastning, ikke til at omskrive kurven.</w:t>
       </w:r>
     </w:p>
     <w:tbl>
@@ -3683,7 +3683,7 @@
           </w:tcPr>
           <w:p>
             <w:r>
-              <w:t>41</w:t>
+              <w:t>43</w:t>
             </w:r>
           </w:p>
         </w:tc>
@@ -3693,7 +3693,7 @@
           </w:tcPr>
           <w:p>
             <w:r>
-              <w:t>46</w:t>
+              <w:t>48</w:t>
             </w:r>
           </w:p>
         </w:tc>
@@ -3745,7 +3745,7 @@
           </w:tcPr>
           <w:p>
             <w:r>
-              <w:t>46</w:t>
+              <w:t>48</w:t>
             </w:r>
           </w:p>
         </w:tc>
@@ -3755,7 +3755,7 @@
           </w:tcPr>
           <w:p>
             <w:r>
-              <w:t>49</w:t>
+              <w:t>52</w:t>
             </w:r>
           </w:p>
         </w:tc>
@@ -3807,17 +3807,17 @@
           </w:tcPr>
           <w:p>
             <w:r>
+              <w:t>52</w:t>
+            </w:r>
+          </w:p>
+        </w:tc>
+        <w:tc>
+          <w:tcPr>
+            <w:tcW w:type="dxa" w:w="1440"/>
+          </w:tcPr>
+          <w:p>
+            <w:r>
               <w:t>49</w:t>
-            </w:r>
-          </w:p>
-        </w:tc>
-        <w:tc>
-          <w:tcPr>
-            <w:tcW w:type="dxa" w:w="1440"/>
-          </w:tcPr>
-          <w:p>
-            <w:r>
-              <w:t>54</w:t>
             </w:r>
           </w:p>
         </w:tc>
@@ -3869,17 +3869,17 @@
           </w:tcPr>
           <w:p>
             <w:r>
+              <w:t>49</w:t>
+            </w:r>
+          </w:p>
+        </w:tc>
+        <w:tc>
+          <w:tcPr>
+            <w:tcW w:type="dxa" w:w="1440"/>
+          </w:tcPr>
+          <w:p>
+            <w:r>
               <w:t>54</w:t>
-            </w:r>
-          </w:p>
-        </w:tc>
-        <w:tc>
-          <w:tcPr>
-            <w:tcW w:type="dxa" w:w="1440"/>
-          </w:tcPr>
-          <w:p>
-            <w:r>
-              <w:t>50</w:t>
             </w:r>
           </w:p>
         </w:tc>
@@ -3931,7 +3931,7 @@
           </w:tcPr>
           <w:p>
             <w:r>
-              <w:t>50</w:t>
+              <w:t>54</w:t>
             </w:r>
           </w:p>
         </w:tc>
@@ -3941,7 +3941,7 @@
           </w:tcPr>
           <w:p>
             <w:r>
-              <w:t>55</w:t>
+              <w:t>59</w:t>
             </w:r>
           </w:p>
         </w:tc>
@@ -3993,7 +3993,7 @@
           </w:tcPr>
           <w:p>
             <w:r>
-              <w:t>55</w:t>
+              <w:t>59</w:t>
             </w:r>
           </w:p>
         </w:tc>
@@ -4003,7 +4003,7 @@
           </w:tcPr>
           <w:p>
             <w:r>
-              <w:t>60</w:t>
+              <w:t>64</w:t>
             </w:r>
           </w:p>
         </w:tc>
@@ -4055,7 +4055,7 @@
           </w:tcPr>
           <w:p>
             <w:r>
-              <w:t>60</w:t>
+              <w:t>64</w:t>
             </w:r>
           </w:p>
         </w:tc>
@@ -4065,7 +4065,7 @@
           </w:tcPr>
           <w:p>
             <w:r>
-              <w:t>64</w:t>
+              <w:t>68</w:t>
             </w:r>
           </w:p>
         </w:tc>
@@ -4117,17 +4117,17 @@
           </w:tcPr>
           <w:p>
             <w:r>
+              <w:t>68</w:t>
+            </w:r>
+          </w:p>
+        </w:tc>
+        <w:tc>
+          <w:tcPr>
+            <w:tcW w:type="dxa" w:w="1440"/>
+          </w:tcPr>
+          <w:p>
+            <w:r>
               <w:t>64</w:t>
-            </w:r>
-          </w:p>
-        </w:tc>
-        <w:tc>
-          <w:tcPr>
-            <w:tcW w:type="dxa" w:w="1440"/>
-          </w:tcPr>
-          <w:p>
-            <w:r>
-              <w:t>60</w:t>
             </w:r>
           </w:p>
         </w:tc>
@@ -4179,7 +4179,7 @@
           </w:tcPr>
           <w:p>
             <w:r>
-              <w:t>60</w:t>
+              <w:t>64</w:t>
             </w:r>
           </w:p>
         </w:tc>
@@ -4189,7 +4189,7 @@
           </w:tcPr>
           <w:p>
             <w:r>
-              <w:t>57</w:t>
+              <w:t>61</w:t>
             </w:r>
           </w:p>
         </w:tc>
@@ -4241,7 +4241,7 @@
           </w:tcPr>
           <w:p>
             <w:r>
-              <w:t>57</w:t>
+              <w:t>61</w:t>
             </w:r>
           </w:p>
         </w:tc>
@@ -4251,7 +4251,7 @@
           </w:tcPr>
           <w:p>
             <w:r>
-              <w:t>54</w:t>
+              <w:t>58</w:t>
             </w:r>
           </w:p>
         </w:tc>
@@ -4286,7 +4286,7 @@
         <w:t xml:space="preserve">Justeringsprincip: </w:t>
       </w:r>
       <w:r>
-        <w:t>Hvis faktisk CTL/TSS afviger markant fra target (f.eks. pga. rejse, sygdom eller en ekstra god uge), justeres KOMMENDE ugers TSS-target tilsvarende — men loftet på +5-8 CTL/uge og TSB-floor på -30 (-35 i camps) overskrives aldrig. Peak CTL ~64 og positiv TSB ved racestart er de faste pejlemærker.</w:t>
+        <w:t>Hvis faktisk CTL/TSS afviger markant fra target (f.eks. pga. rejse, sygdom eller en ekstra god uge), justeres KOMMENDE ugers TSS-target tilsvarende — men loftet på +5-8 CTL/uge og TSB-floor på -30 (-35 i camps) overskrives aldrig. Peak CTL ~68 og positiv TSB ved racestart er de faste pejlemærker.</w:t>
       </w:r>
     </w:p>
     <w:sectPr>

</xml_diff>

<commit_message>
masterplan opdateret (adjust a03ba610)
</commit_message>
<xml_diff>
--- a/data/Fast_as_Fifty_Masterplan_2026.docx
+++ b/data/Fast_as_Fifty_Masterplan_2026.docx
@@ -4196,6 +4196,9 @@
               <w:br/>
               <w:br/>
               <w:t>Efter testen: threshold-pace = snit af sidste 20 min. Opdatér zoner i Intervals + config.</w:t>
+              <w:br/>
+              <w:br/>
+              <w:t>THRESHOLD-TEST løb 30 min — opdatér pace-zoner</w:t>
             </w:r>
           </w:p>
         </w:tc>
@@ -5429,7 +5432,7 @@
               <w:t>- Let ud-svøm + exit-rutine 10m freeride</w:t>
               <w:br/>
               <w:br/>
-              <w:t>OW-svøm 45 min — Christiansborg-prep</w:t>
+              <w:t>[e2e-test-note]</w:t>
             </w:r>
           </w:p>
         </w:tc>

</xml_diff>

<commit_message>
masterplan opdateret (restore_from_commit N/A)
</commit_message>
<xml_diff>
--- a/data/Fast_as_Fifty_Masterplan_2026.docx
+++ b/data/Fast_as_Fifty_Masterplan_2026.docx
@@ -4134,6 +4134,9 @@
               <w:br/>
               <w:br/>
               <w:t>Efter testen: nyt FTP = 95% af 20-min snit-watt. Opdatér i Intervals → Settings.</w:t>
+              <w:br/>
+              <w:br/>
+              <w:t>FTP-TEST 20 min — opdatér watt-zoner</w:t>
             </w:r>
           </w:p>
         </w:tc>
@@ -4193,6 +4196,9 @@
               <w:br/>
               <w:br/>
               <w:t>Efter testen: threshold-pace = snit af sidste 20 min. Opdatér zoner i Intervals + config.</w:t>
+              <w:br/>
+              <w:br/>
+              <w:t>THRESHOLD-TEST løb 30 min — opdatér pace-zoner</w:t>
             </w:r>
           </w:p>
         </w:tc>
@@ -5426,7 +5432,7 @@
               <w:t>- Let ud-svøm + exit-rutine 10m freeride</w:t>
               <w:br/>
               <w:br/>
-              <w:t>[e2e-test-note]</w:t>
+              <w:t>OW-svøm 45 min — Christiansborg-prep</w:t>
             </w:r>
           </w:p>
         </w:tc>

</xml_diff>

<commit_message>
masterplan opdateret (move 101f4875)
</commit_message>
<xml_diff>
--- a/data/Fast_as_Fifty_Masterplan_2026.docx
+++ b/data/Fast_as_Fifty_Masterplan_2026.docx
@@ -76,7 +76,7 @@
           <w:color w:val="7A6A58"/>
           <w:sz w:val="20"/>
         </w:rPr>
-        <w:t>Genereret 2026-07-07 fra plan.json</w:t>
+        <w:t>Genereret 2026-07-09 fra plan.json</w:t>
       </w:r>
     </w:p>
     <w:p>
@@ -2782,7 +2782,7 @@
               <w:rPr>
                 <w:sz w:val="20"/>
               </w:rPr>
-              <w:t>Trail-løb Z2 Wales 55 min · 55 min</w:t>
+              <w:t>Trail langtur Z2 Wales 75 min · 75 min</w:t>
             </w:r>
           </w:p>
         </w:tc>
@@ -2798,12 +2798,12 @@
               </w:rPr>
               <w:t>- Varm-op 10m &gt;5:35/km Pace</w:t>
               <w:br/>
-              <w:t>- Trail-løb Z2 Wales — Z2-indsats, pace følger terræn 40m freeride</w:t>
+              <w:t>- Trail langtur Z2 Wales — Z2-indsats, pace følger terræn 60m freeride</w:t>
               <w:br/>
               <w:t>- Cool-down 5m &gt;5:35/km Pace</w:t>
               <w:br/>
               <w:br/>
-              <w:t>Trail-løb Z2 Wales 55 min — TÅ-TEST: stop ved smerte</w:t>
+              <w:t>Trail langtur Z2 Wales 75 min — kun hvis tåen holdt fredag. Hjemrejse aften</w:t>
             </w:r>
           </w:p>
         </w:tc>
@@ -2880,7 +2880,7 @@
               <w:rPr>
                 <w:sz w:val="20"/>
               </w:rPr>
-              <w:t>Trail langtur Z2 Wales 75 min · 75 min</w:t>
+              <w:t>Trail-løb Z2 Wales 55 min · 55 min</w:t>
             </w:r>
           </w:p>
         </w:tc>
@@ -2896,12 +2896,12 @@
               </w:rPr>
               <w:t>- Varm-op 10m &gt;5:35/km Pace</w:t>
               <w:br/>
-              <w:t>- Trail langtur Z2 Wales — Z2-indsats, pace følger terræn 60m freeride</w:t>
+              <w:t>- Trail-løb Z2 Wales — Z2-indsats, pace følger terræn 40m freeride</w:t>
               <w:br/>
               <w:t>- Cool-down 5m &gt;5:35/km Pace</w:t>
               <w:br/>
               <w:br/>
-              <w:t>Trail langtur Z2 Wales 75 min — kun hvis tåen holdt fredag. Hjemrejse aften</w:t>
+              <w:t>Trail-løb Z2 Wales 55 min — TÅ-TEST: stop ved smerte</w:t>
             </w:r>
           </w:p>
         </w:tc>

</xml_diff>

<commit_message>
masterplan opdateret (adjust 4f95bbd3)
</commit_message>
<xml_diff>
--- a/data/Fast_as_Fifty_Masterplan_2026.docx
+++ b/data/Fast_as_Fifty_Masterplan_2026.docx
@@ -2803,7 +2803,7 @@
               <w:t>- Cool-down 5m &gt;5:35/km Pace</w:t>
               <w:br/>
               <w:br/>
-              <w:t>Trail langtur Z2 Wales 75 min — kun hvis tåen holdt fredag. Hjemrejse aften</w:t>
+              <w:t>Trail langtur Z2 Wales 75 min — flyttet fra søndag. Hold ægte Z2, stop ved tå-smerte.</w:t>
             </w:r>
           </w:p>
         </w:tc>
@@ -2833,7 +2833,7 @@
               <w:rPr>
                 <w:sz w:val="20"/>
               </w:rPr>
-              <w:t>Hike let 90 min · 1t 30m</w:t>
+              <w:t>Hike let 90 min · 80 min</w:t>
             </w:r>
           </w:p>
         </w:tc>
@@ -2901,7 +2901,7 @@
               <w:t>- Cool-down 5m &gt;5:35/km Pace</w:t>
               <w:br/>
               <w:br/>
-              <w:t>Trail-løb Z2 Wales 55 min — TÅ-TEST: stop ved smerte</w:t>
+              <w:t>Trail-løb Z2 Wales 55 min — flyttet fra fredag. Let, før hjemrejse aften. Stop ved tå-smerte.</w:t>
             </w:r>
           </w:p>
         </w:tc>

</xml_diff>

<commit_message>
masterplan opdateret (adjust 101f4875)
</commit_message>
<xml_diff>
--- a/data/Fast_as_Fifty_Masterplan_2026.docx
+++ b/data/Fast_as_Fifty_Masterplan_2026.docx
@@ -76,7 +76,7 @@
           <w:color w:val="7A6A58"/>
           <w:sz w:val="20"/>
         </w:rPr>
-        <w:t>Genereret 2026-07-10 fra plan.json</w:t>
+        <w:t>Genereret 2026-07-11 fra plan.json</w:t>
       </w:r>
     </w:p>
     <w:p>
@@ -2880,7 +2880,7 @@
               <w:rPr>
                 <w:sz w:val="20"/>
               </w:rPr>
-              <w:t>Trail-løb Z2 Wales 55 min · 55 min</w:t>
+              <w:t>Hike - 3 timer · 3t</w:t>
             </w:r>
           </w:p>
         </w:tc>
@@ -2894,14 +2894,6 @@
               <w:rPr>
                 <w:sz w:val="20"/>
               </w:rPr>
-              <w:t>- Varm-op 10m &gt;5:35/km Pace</w:t>
-              <w:br/>
-              <w:t>- Trail-løb Z2 Wales — Z2-indsats, pace følger terræn 40m freeride</w:t>
-              <w:br/>
-              <w:t>- Cool-down 5m &gt;5:35/km Pace</w:t>
-              <w:br/>
-              <w:br/>
-              <w:t>Trail-løb Z2 Wales 55 min — flyttet fra fredag. Let, før hjemrejse aften. Stop ved tå-smerte.</w:t>
             </w:r>
           </w:p>
         </w:tc>

</xml_diff>

<commit_message>
masterplan opdateret (move 1bea6a75)
</commit_message>
<xml_diff>
--- a/data/Fast_as_Fifty_Masterplan_2026.docx
+++ b/data/Fast_as_Fifty_Masterplan_2026.docx
@@ -76,7 +76,7 @@
           <w:color w:val="7A6A58"/>
           <w:sz w:val="20"/>
         </w:rPr>
-        <w:t>Genereret 2026-07-11 fra plan.json</w:t>
+        <w:t>Genereret 2026-07-13 fra plan.json</w:t>
       </w:r>
     </w:p>
     <w:p>
@@ -3017,9 +3017,7 @@
               <w:rPr>
                 <w:sz w:val="20"/>
               </w:rPr>
-              <w:t>Svøm 2000m teknisk · 60 min</w:t>
-              <w:br/>
-              <w:t>Styrke A Functional Strength 3 sæt · 60 min</w:t>
+              <w:t>Løb VO2 5×3 min Z4 · 65 min</w:t>
             </w:r>
           </w:p>
         </w:tc>
@@ -3033,49 +3031,20 @@
               <w:rPr>
                 <w:sz w:val="20"/>
               </w:rPr>
-              <w:t>- 400m varm-op Z1 10m freeride</w:t>
-              <w:br/>
-              <w:br/>
-              <w:t>6x</w:t>
-              <w:br/>
-              <w:t>- 100m teknik Z2 2m freeride</w:t>
-              <w:br/>
-              <w:br/>
-              <w:br/>
-              <w:t>8x</w:t>
-              <w:br/>
-              <w:t>- 100m moderat Z3 2m freeride</w:t>
-              <w:br/>
-              <w:t>- 30s pause 1m freeride</w:t>
-              <w:br/>
-              <w:br/>
-              <w:t>- 400m cool Z1 10m freeride</w:t>
-              <w:br/>
-              <w:br/>
-              <w:t>Svøm 2000m — morgen</w:t>
-              <w:br/>
-              <w:br/>
-              <w:t>3x</w:t>
-              <w:br/>
-              <w:t>- Thruster 12.5kg ×10 1m freeride</w:t>
-              <w:br/>
-              <w:t>- Renegade Row ×8 1m freeride</w:t>
-              <w:br/>
-              <w:t>- Push-up ×10 1m freeride</w:t>
-              <w:br/>
-              <w:t>- KB Swing 16kg ×15 1m freeride</w:t>
-              <w:br/>
-              <w:t>- RDL ×10 1m freeride</w:t>
-              <w:br/>
-              <w:t>- Bulgarian Split Squat ×8/ben 1m freeride</w:t>
-              <w:br/>
-              <w:t>- Pause 90 sek 2m freeride</w:t>
-              <w:br/>
-              <w:br/>
-              <w:t>- Walk Z1 30m freeride</w:t>
-              <w:br/>
-              <w:br/>
-              <w:t>Styrke A Functional Strength 3 sæt</w:t>
+              <w:t>- Varm-op 15m &gt;5:35/km Pace</w:t>
+              <w:br/>
+              <w:br/>
+              <w:t>5x</w:t>
+              <w:br/>
+              <w:t>- Interval 3m 4:13-4:25/km Pace</w:t>
+              <w:br/>
+              <w:t>- Pause 2m &gt;5:35/km Pace</w:t>
+              <w:br/>
+              <w:br/>
+              <w:t>- Cool-down 10m &gt;5:35/km Pace</w:t>
+              <w:br/>
+              <w:br/>
+              <w:t>Løb VO2 5×3 Z4 — ugens stimulus</w:t>
             </w:r>
           </w:p>
         </w:tc>
@@ -3105,7 +3074,9 @@
               <w:rPr>
                 <w:sz w:val="20"/>
               </w:rPr>
-              <w:t>Løb VO2 5×3 min Z4 · 65 min</w:t>
+              <w:t>Svøm 2000m teknisk · 60 min</w:t>
+              <w:br/>
+              <w:t>Styrke A Functional Strength 3 sæt · 60 min</w:t>
             </w:r>
           </w:p>
         </w:tc>
@@ -3119,20 +3090,49 @@
               <w:rPr>
                 <w:sz w:val="20"/>
               </w:rPr>
-              <w:t>- Varm-op 15m &gt;5:35/km Pace</w:t>
-              <w:br/>
-              <w:br/>
-              <w:t>5x</w:t>
-              <w:br/>
-              <w:t>- Interval 3m 4:13-4:25/km Pace</w:t>
-              <w:br/>
-              <w:t>- Pause 2m &gt;5:35/km Pace</w:t>
-              <w:br/>
-              <w:br/>
-              <w:t>- Cool-down 10m &gt;5:35/km Pace</w:t>
-              <w:br/>
-              <w:br/>
-              <w:t>Løb VO2 5×3 Z4 — ugens stimulus</w:t>
+              <w:t>- 400m varm-op Z1 10m freeride</w:t>
+              <w:br/>
+              <w:br/>
+              <w:t>6x</w:t>
+              <w:br/>
+              <w:t>- 100m teknik Z2 2m freeride</w:t>
+              <w:br/>
+              <w:br/>
+              <w:br/>
+              <w:t>8x</w:t>
+              <w:br/>
+              <w:t>- 100m moderat Z3 2m freeride</w:t>
+              <w:br/>
+              <w:t>- 30s pause 1m freeride</w:t>
+              <w:br/>
+              <w:br/>
+              <w:t>- 400m cool Z1 10m freeride</w:t>
+              <w:br/>
+              <w:br/>
+              <w:t>Svøm 2000m — morgen</w:t>
+              <w:br/>
+              <w:br/>
+              <w:t>3x</w:t>
+              <w:br/>
+              <w:t>- Thruster 12.5kg ×10 1m freeride</w:t>
+              <w:br/>
+              <w:t>- Renegade Row ×8 1m freeride</w:t>
+              <w:br/>
+              <w:t>- Push-up ×10 1m freeride</w:t>
+              <w:br/>
+              <w:t>- KB Swing 16kg ×15 1m freeride</w:t>
+              <w:br/>
+              <w:t>- RDL ×10 1m freeride</w:t>
+              <w:br/>
+              <w:t>- Bulgarian Split Squat ×8/ben 1m freeride</w:t>
+              <w:br/>
+              <w:t>- Pause 90 sek 2m freeride</w:t>
+              <w:br/>
+              <w:br/>
+              <w:t>- Walk Z1 30m freeride</w:t>
+              <w:br/>
+              <w:br/>
+              <w:t>Styrke A Functional Strength 3 sæt</w:t>
             </w:r>
           </w:p>
         </w:tc>

</xml_diff>

<commit_message>
docx: regenereret med sæson-2027-side
</commit_message>
<xml_diff>
--- a/data/Fast_as_Fifty_Masterplan_2026.docx
+++ b/data/Fast_as_Fifty_Masterplan_2026.docx
@@ -76,7 +76,7 @@
           <w:color w:val="7A6A58"/>
           <w:sz w:val="20"/>
         </w:rPr>
-        <w:t>Genereret 2026-07-13 fra plan.json</w:t>
+        <w:t>Genereret 2026-07-16 fra plan.json</w:t>
       </w:r>
     </w:p>
     <w:p>
@@ -7099,6 +7099,574 @@
         </w:tc>
       </w:tr>
     </w:tbl>
+    <w:p>
+      <w:r>
+        <w:br w:type="page"/>
+      </w:r>
+    </w:p>
+    <w:p>
+      <w:r>
+        <w:rPr>
+          <w:rFonts w:ascii="Calibri" w:hAnsi="Calibri"/>
+          <w:b/>
+          <w:color w:val="BE863A"/>
+          <w:sz w:val="36"/>
+        </w:rPr>
+        <w:t>SÆSON 2027</w:t>
+      </w:r>
+    </w:p>
+    <w:p>
+      <w:r>
+        <w:rPr>
+          <w:rFonts w:ascii="Calibri" w:hAnsi="Calibri"/>
+          <w:b/>
+          <w:sz w:val="24"/>
+        </w:rPr>
+        <w:t>A-løb: Tour des Stations Ultrafondo · 28. aug 2027 · 242 km / 8.848 hm</w:t>
+      </w:r>
+    </w:p>
+    <w:p>
+      <w:r>
+        <w:rPr>
+          <w:rFonts w:ascii="Calibri" w:hAnsi="Calibri"/>
+          <w:b w:val="0"/>
+          <w:color w:val="7A6A58"/>
+          <w:sz w:val="20"/>
+        </w:rPr>
+        <w:t>CTL 82 på startlinjen (peak 88) · FTP 270 → 292 · 12 t/uge i snit, 15 i toppen</w:t>
+      </w:r>
+    </w:p>
+    <w:tbl>
+      <w:tblPr>
+        <w:tblStyle w:val="LightGrid-Accent1"/>
+        <w:tblW w:type="auto" w:w="0"/>
+        <w:tblLook w:firstColumn="1" w:firstRow="1" w:lastColumn="0" w:lastRow="0" w:noHBand="0" w:noVBand="1" w:val="04A0"/>
+      </w:tblPr>
+      <w:tblGrid>
+        <w:gridCol w:w="1728"/>
+        <w:gridCol w:w="1728"/>
+        <w:gridCol w:w="1728"/>
+        <w:gridCol w:w="1728"/>
+        <w:gridCol w:w="1728"/>
+      </w:tblGrid>
+      <w:tr>
+        <w:tc>
+          <w:tcPr>
+            <w:tcW w:type="dxa" w:w="1728"/>
+          </w:tcPr>
+          <w:p>
+            <w:r>
+              <w:rPr>
+                <w:b/>
+              </w:rPr>
+              <w:t>Fase</w:t>
+            </w:r>
+          </w:p>
+        </w:tc>
+        <w:tc>
+          <w:tcPr>
+            <w:tcW w:type="dxa" w:w="1728"/>
+          </w:tcPr>
+          <w:p>
+            <w:r>
+              <w:rPr>
+                <w:b/>
+              </w:rPr>
+              <w:t>Uger</w:t>
+            </w:r>
+          </w:p>
+        </w:tc>
+        <w:tc>
+          <w:tcPr>
+            <w:tcW w:type="dxa" w:w="1728"/>
+          </w:tcPr>
+          <w:p>
+            <w:r>
+              <w:rPr>
+                <w:b/>
+              </w:rPr>
+              <w:t>Periode</w:t>
+            </w:r>
+          </w:p>
+        </w:tc>
+        <w:tc>
+          <w:tcPr>
+            <w:tcW w:type="dxa" w:w="1728"/>
+          </w:tcPr>
+          <w:p>
+            <w:r>
+              <w:rPr>
+                <w:b/>
+              </w:rPr>
+              <w:t>CTL</w:t>
+            </w:r>
+          </w:p>
+        </w:tc>
+        <w:tc>
+          <w:tcPr>
+            <w:tcW w:type="dxa" w:w="1728"/>
+          </w:tcPr>
+          <w:p>
+            <w:r>
+              <w:rPr>
+                <w:b/>
+              </w:rPr>
+              <w:t>FTP</w:t>
+            </w:r>
+          </w:p>
+        </w:tc>
+      </w:tr>
+      <w:tr>
+        <w:tc>
+          <w:tcPr>
+            <w:tcW w:type="dxa" w:w="1728"/>
+          </w:tcPr>
+          <w:p>
+            <w:r>
+              <w:t>TRANSITION</w:t>
+            </w:r>
+          </w:p>
+        </w:tc>
+        <w:tc>
+          <w:tcPr>
+            <w:tcW w:type="dxa" w:w="1728"/>
+          </w:tcPr>
+          <w:p>
+            <w:r>
+              <w:t>1-8</w:t>
+            </w:r>
+          </w:p>
+        </w:tc>
+        <w:tc>
+          <w:tcPr>
+            <w:tcW w:type="dxa" w:w="1728"/>
+          </w:tcPr>
+          <w:p>
+            <w:r>
+              <w:t>7. sep 26 → 1. nov 26</w:t>
+            </w:r>
+          </w:p>
+        </w:tc>
+        <w:tc>
+          <w:tcPr>
+            <w:tcW w:type="dxa" w:w="1728"/>
+          </w:tcPr>
+          <w:p>
+            <w:r>
+              <w:t>50→55</w:t>
+            </w:r>
+          </w:p>
+        </w:tc>
+        <w:tc>
+          <w:tcPr>
+            <w:tcW w:type="dxa" w:w="1728"/>
+          </w:tcPr>
+          <w:p>
+            <w:r>
+              <w:t>270</w:t>
+            </w:r>
+          </w:p>
+        </w:tc>
+      </w:tr>
+      <w:tr>
+        <w:tc>
+          <w:tcPr>
+            <w:tcW w:type="dxa" w:w="1728"/>
+          </w:tcPr>
+          <w:p>
+            <w:r>
+              <w:t>BASE</w:t>
+            </w:r>
+          </w:p>
+        </w:tc>
+        <w:tc>
+          <w:tcPr>
+            <w:tcW w:type="dxa" w:w="1728"/>
+          </w:tcPr>
+          <w:p>
+            <w:r>
+              <w:t>9-22</w:t>
+            </w:r>
+          </w:p>
+        </w:tc>
+        <w:tc>
+          <w:tcPr>
+            <w:tcW w:type="dxa" w:w="1728"/>
+          </w:tcPr>
+          <w:p>
+            <w:r>
+              <w:t>2. nov 26 → 7. feb 27</w:t>
+            </w:r>
+          </w:p>
+        </w:tc>
+        <w:tc>
+          <w:tcPr>
+            <w:tcW w:type="dxa" w:w="1728"/>
+          </w:tcPr>
+          <w:p>
+            <w:r>
+              <w:t>57→68</w:t>
+            </w:r>
+          </w:p>
+        </w:tc>
+        <w:tc>
+          <w:tcPr>
+            <w:tcW w:type="dxa" w:w="1728"/>
+          </w:tcPr>
+          <w:p>
+            <w:r>
+              <w:t>278</w:t>
+            </w:r>
+          </w:p>
+        </w:tc>
+      </w:tr>
+      <w:tr>
+        <w:tc>
+          <w:tcPr>
+            <w:tcW w:type="dxa" w:w="1728"/>
+          </w:tcPr>
+          <w:p>
+            <w:r>
+              <w:t>BUILD</w:t>
+            </w:r>
+          </w:p>
+        </w:tc>
+        <w:tc>
+          <w:tcPr>
+            <w:tcW w:type="dxa" w:w="1728"/>
+          </w:tcPr>
+          <w:p>
+            <w:r>
+              <w:t>23-35</w:t>
+            </w:r>
+          </w:p>
+        </w:tc>
+        <w:tc>
+          <w:tcPr>
+            <w:tcW w:type="dxa" w:w="1728"/>
+          </w:tcPr>
+          <w:p>
+            <w:r>
+              <w:t>8. feb 27 → 9. maj 27</w:t>
+            </w:r>
+          </w:p>
+        </w:tc>
+        <w:tc>
+          <w:tcPr>
+            <w:tcW w:type="dxa" w:w="1728"/>
+          </w:tcPr>
+          <w:p>
+            <w:r>
+              <w:t>70→79</w:t>
+            </w:r>
+          </w:p>
+        </w:tc>
+        <w:tc>
+          <w:tcPr>
+            <w:tcW w:type="dxa" w:w="1728"/>
+          </w:tcPr>
+          <w:p>
+            <w:r>
+              <w:t>285</w:t>
+            </w:r>
+          </w:p>
+        </w:tc>
+      </w:tr>
+      <w:tr>
+        <w:tc>
+          <w:tcPr>
+            <w:tcW w:type="dxa" w:w="1728"/>
+          </w:tcPr>
+          <w:p>
+            <w:r>
+              <w:t>STELVIO</w:t>
+            </w:r>
+          </w:p>
+        </w:tc>
+        <w:tc>
+          <w:tcPr>
+            <w:tcW w:type="dxa" w:w="1728"/>
+          </w:tcPr>
+          <w:p>
+            <w:r>
+              <w:t>36-39</w:t>
+            </w:r>
+          </w:p>
+        </w:tc>
+        <w:tc>
+          <w:tcPr>
+            <w:tcW w:type="dxa" w:w="1728"/>
+          </w:tcPr>
+          <w:p>
+            <w:r>
+              <w:t>10. maj 27 → 6. jun 27</w:t>
+            </w:r>
+          </w:p>
+        </w:tc>
+        <w:tc>
+          <w:tcPr>
+            <w:tcW w:type="dxa" w:w="1728"/>
+          </w:tcPr>
+          <w:p>
+            <w:r>
+              <w:t>81→78</w:t>
+            </w:r>
+          </w:p>
+        </w:tc>
+        <w:tc>
+          <w:tcPr>
+            <w:tcW w:type="dxa" w:w="1728"/>
+          </w:tcPr>
+          <w:p>
+            <w:r>
+              <w:t>288</w:t>
+            </w:r>
+          </w:p>
+        </w:tc>
+      </w:tr>
+      <w:tr>
+        <w:tc>
+          <w:tcPr>
+            <w:tcW w:type="dxa" w:w="1728"/>
+          </w:tcPr>
+          <w:p>
+            <w:r>
+              <w:t>SPECIFIK</w:t>
+            </w:r>
+          </w:p>
+        </w:tc>
+        <w:tc>
+          <w:tcPr>
+            <w:tcW w:type="dxa" w:w="1728"/>
+          </w:tcPr>
+          <w:p>
+            <w:r>
+              <w:t>40-49</w:t>
+            </w:r>
+          </w:p>
+        </w:tc>
+        <w:tc>
+          <w:tcPr>
+            <w:tcW w:type="dxa" w:w="1728"/>
+          </w:tcPr>
+          <w:p>
+            <w:r>
+              <w:t>7. jun 27 → 15. aug 27</w:t>
+            </w:r>
+          </w:p>
+        </w:tc>
+        <w:tc>
+          <w:tcPr>
+            <w:tcW w:type="dxa" w:w="1728"/>
+          </w:tcPr>
+          <w:p>
+            <w:r>
+              <w:t>76→87</w:t>
+            </w:r>
+          </w:p>
+        </w:tc>
+        <w:tc>
+          <w:tcPr>
+            <w:tcW w:type="dxa" w:w="1728"/>
+          </w:tcPr>
+          <w:p>
+            <w:r>
+              <w:t>292</w:t>
+            </w:r>
+          </w:p>
+        </w:tc>
+      </w:tr>
+      <w:tr>
+        <w:tc>
+          <w:tcPr>
+            <w:tcW w:type="dxa" w:w="1728"/>
+          </w:tcPr>
+          <w:p>
+            <w:r>
+              <w:t>TAPER</w:t>
+            </w:r>
+          </w:p>
+        </w:tc>
+        <w:tc>
+          <w:tcPr>
+            <w:tcW w:type="dxa" w:w="1728"/>
+          </w:tcPr>
+          <w:p>
+            <w:r>
+              <w:t>50-51</w:t>
+            </w:r>
+          </w:p>
+        </w:tc>
+        <w:tc>
+          <w:tcPr>
+            <w:tcW w:type="dxa" w:w="1728"/>
+          </w:tcPr>
+          <w:p>
+            <w:r>
+              <w:t>16. aug 27 → 29. aug 27</w:t>
+            </w:r>
+          </w:p>
+        </w:tc>
+        <w:tc>
+          <w:tcPr>
+            <w:tcW w:type="dxa" w:w="1728"/>
+          </w:tcPr>
+          <w:p>
+            <w:r>
+              <w:t>85→82</w:t>
+            </w:r>
+          </w:p>
+        </w:tc>
+        <w:tc>
+          <w:tcPr>
+            <w:tcW w:type="dxa" w:w="1728"/>
+          </w:tcPr>
+          <w:p>
+            <w:r>
+              <w:t>292</w:t>
+            </w:r>
+          </w:p>
+        </w:tc>
+      </w:tr>
+    </w:tbl>
+    <w:p>
+      <w:r>
+        <w:rPr>
+          <w:rFonts w:ascii="Calibri" w:hAnsi="Calibri"/>
+          <w:b/>
+          <w:color w:val="BE863A"/>
+          <w:sz w:val="22"/>
+        </w:rPr>
+        <w:t>Lejre — her bygges CTL</w:t>
+      </w:r>
+    </w:p>
+    <w:p>
+      <w:r>
+        <w:rPr>
+          <w:rFonts w:ascii="Calibri" w:hAnsi="Calibri"/>
+          <w:b w:val="0"/>
+          <w:sz w:val="20"/>
+        </w:rPr>
+        <w:t>Uge 30 · 29. mar 2027 · Mallorca · CTL 80 · 750 TSS</w:t>
+      </w:r>
+    </w:p>
+    <w:p>
+      <w:r>
+        <w:rPr>
+          <w:rFonts w:ascii="Calibri" w:hAnsi="Calibri"/>
+          <w:b w:val="0"/>
+          <w:color w:val="7A6A58"/>
+          <w:sz w:val="18"/>
+        </w:rPr>
+        <w:t xml:space="preserve">    LEJR #1. 20-25 t. Her bygges CTL — ikke i Gentofte.</w:t>
+      </w:r>
+    </w:p>
+    <w:p>
+      <w:r>
+        <w:rPr>
+          <w:rFonts w:ascii="Calibri" w:hAnsi="Calibri"/>
+          <w:b w:val="0"/>
+          <w:sz w:val="20"/>
+        </w:rPr>
+        <w:t>Uge 46 · 19. jul 2027 · Alperne · CTL 88 · 780 TSS</w:t>
+      </w:r>
+    </w:p>
+    <w:p>
+      <w:r>
+        <w:rPr>
+          <w:rFonts w:ascii="Calibri" w:hAnsi="Calibri"/>
+          <w:b w:val="0"/>
+          <w:color w:val="7A6A58"/>
+          <w:sz w:val="18"/>
+        </w:rPr>
+        <w:t xml:space="preserve">    LEJR #2. Back-to-back bjergdage. CTL-peak. Gearing testes.</w:t>
+      </w:r>
+    </w:p>
+    <w:p>
+      <w:r>
+        <w:rPr>
+          <w:rFonts w:ascii="Calibri" w:hAnsi="Calibri"/>
+          <w:b/>
+          <w:color w:val="BE863A"/>
+          <w:sz w:val="22"/>
+        </w:rPr>
+        <w:t>Løb</w:t>
+      </w:r>
+    </w:p>
+    <w:p>
+      <w:r>
+        <w:rPr>
+          <w:rFonts w:ascii="Calibri" w:hAnsi="Calibri"/>
+          <w:b w:val="0"/>
+          <w:sz w:val="20"/>
+        </w:rPr>
+        <w:t>Uge 39 · 31. maj 2027 · Bormio · CTL 78 · 350 TSS</w:t>
+      </w:r>
+    </w:p>
+    <w:p>
+      <w:r>
+        <w:rPr>
+          <w:rFonts w:ascii="Calibri" w:hAnsi="Calibri"/>
+          <w:b w:val="0"/>
+          <w:color w:val="7A6A58"/>
+          <w:sz w:val="18"/>
+        </w:rPr>
+        <w:t xml:space="preserve">    STELVIO GRAN FONDO søn 6/6 — B-løb. Hyggetur med Eva + form-check.</w:t>
+      </w:r>
+    </w:p>
+    <w:p>
+      <w:r>
+        <w:rPr>
+          <w:rFonts w:ascii="Calibri" w:hAnsi="Calibri"/>
+          <w:b w:val="0"/>
+          <w:sz w:val="20"/>
+        </w:rPr>
+        <w:t>Uge 51 · 23. aug 2027 · Le Châble/Verbier · CTL 82 · 180 TSS</w:t>
+      </w:r>
+    </w:p>
+    <w:p>
+      <w:r>
+        <w:rPr>
+          <w:rFonts w:ascii="Calibri" w:hAnsi="Calibri"/>
+          <w:b w:val="0"/>
+          <w:color w:val="7A6A58"/>
+          <w:sz w:val="18"/>
+        </w:rPr>
+        <w:t xml:space="preserve">    TOUR DES STATIONS ULTRAFONDO lør 28/8 — A-løb. Start 02:30.</w:t>
+      </w:r>
+    </w:p>
+    <w:p>
+      <w:r>
+        <w:rPr>
+          <w:rFonts w:ascii="Calibri" w:hAnsi="Calibri"/>
+          <w:b/>
+          <w:color w:val="BE863A"/>
+          <w:sz w:val="22"/>
+        </w:rPr>
+        <w:t>Vægt</w:t>
+      </w:r>
+    </w:p>
+    <w:p>
+      <w:r>
+        <w:rPr>
+          <w:rFonts w:ascii="Calibri" w:hAnsi="Calibri"/>
+          <w:b w:val="0"/>
+          <w:sz w:val="20"/>
+        </w:rPr>
+        <w:t>71.9 → 70 kg, max 0.25 kg/uge. Mål nået 2026-11, derefter vedligehold.</w:t>
+      </w:r>
+    </w:p>
+    <w:p>
+      <w:r>
+        <w:rPr>
+          <w:rFonts w:ascii="Calibri" w:hAnsi="Calibri"/>
+          <w:b w:val="0"/>
+          <w:color w:val="7A6A58"/>
+          <w:sz w:val="18"/>
+        </w:rPr>
+        <w:t xml:space="preserve">    Vægt nås nov-26, derefter vedligehold i 9 mdr. Der slankes ikke under en build.</w:t>
+      </w:r>
+    </w:p>
     <w:sectPr>
       <w:pgSz w:w="12240" w:h="15840"/>
       <w:pgMar w:top="1440" w:right="1800" w:bottom="1440" w:left="1800" w:header="720" w:footer="720" w:gutter="0"/>

</xml_diff>